<commit_message>
waxaan soo commit gareeyey Documentation FILE 2
</commit_message>
<xml_diff>
--- a/Documention.md.docx
+++ b/Documention.md.docx
@@ -13,6 +13,61 @@
     <w:p>
       <w:r>
         <w:t>The backend powers the Venue Booking Management System by handling all application logic and communication between the frontend and the database. It is responsible for processing user requests, managing venue information, handling bookings, and ensuring that only authorized users can access protected features.</w:t>
+      </w:r>
+    </w:p>
+    <w:p>
+      <w:pPr>
+        <w:rPr>
+          <w:rFonts w:cs="Times New Roman"/>
+        </w:rPr>
+      </w:pPr>
+      <w:r>
+        <w:rPr>
+          <w:rFonts w:cs="Times New Roman"/>
+        </w:rPr>
+        <w:t xml:space="preserve">The backend is developed using </w:t>
+      </w:r>
+      <w:r>
+        <w:rPr>
+          <w:rFonts w:cs="Times New Roman"/>
+          <w:b/>
+          <w:bCs/>
+        </w:rPr>
+        <w:t>Node.js</w:t>
+      </w:r>
+      <w:r>
+        <w:rPr>
+          <w:rFonts w:cs="Times New Roman"/>
+        </w:rPr>
+        <w:t xml:space="preserve">, </w:t>
+      </w:r>
+      <w:r>
+        <w:rPr>
+          <w:rFonts w:cs="Times New Roman"/>
+          <w:b/>
+          <w:bCs/>
+        </w:rPr>
+        <w:t>Express.js</w:t>
+      </w:r>
+      <w:r>
+        <w:rPr>
+          <w:rFonts w:cs="Times New Roman"/>
+        </w:rPr>
+        <w:t xml:space="preserve">, and </w:t>
+      </w:r>
+      <w:r>
+        <w:rPr>
+          <w:rFonts w:cs="Times New Roman"/>
+          <w:b/>
+          <w:bCs/>
+        </w:rPr>
+        <w:t>MongoDB</w:t>
+      </w:r>
+      <w:r>
+        <w:rPr>
+          <w:rFonts w:cs="Times New Roman"/>
+        </w:rPr>
+        <w:t>, providing a reliable and scalable foundation for the application.</w:t>
       </w:r>
     </w:p>
     <w:p/>

</xml_diff>

<commit_message>
waxaan soo commit gareeyey Documentation FILE 3
</commit_message>
<xml_diff>
--- a/Documention.md.docx
+++ b/Documention.md.docx
@@ -69,6 +69,178 @@
         </w:rPr>
         <w:t>, providing a reliable and scalable foundation for the application.</w:t>
       </w:r>
+    </w:p>
+    <w:p>
+      <w:pPr>
+        <w:pStyle w:val="Heading2"/>
+      </w:pPr>
+      <w:r>
+        <w:t>Main Functions</w:t>
+      </w:r>
+    </w:p>
+    <w:p>
+      <w:pPr>
+        <w:rPr>
+          <w:rFonts w:cs="Times New Roman"/>
+        </w:rPr>
+      </w:pPr>
+      <w:r>
+        <w:rPr>
+          <w:rFonts w:cs="Times New Roman"/>
+        </w:rPr>
+        <w:t>The backend performs the following tasks:</w:t>
+      </w:r>
+    </w:p>
+    <w:p>
+      <w:pPr>
+        <w:numPr>
+          <w:ilvl w:val="0"/>
+          <w:numId w:val="7"/>
+        </w:numPr>
+        <w:spacing w:line="278" w:lineRule="auto"/>
+        <w:rPr>
+          <w:rFonts w:cs="Times New Roman"/>
+        </w:rPr>
+      </w:pPr>
+      <w:r>
+        <w:rPr>
+          <w:rFonts w:cs="Times New Roman"/>
+        </w:rPr>
+        <w:t>Authenticate users and manage secure login sessions using JWT.</w:t>
+      </w:r>
+    </w:p>
+    <w:p>
+      <w:pPr>
+        <w:numPr>
+          <w:ilvl w:val="0"/>
+          <w:numId w:val="7"/>
+        </w:numPr>
+        <w:spacing w:line="278" w:lineRule="auto"/>
+        <w:rPr>
+          <w:rFonts w:cs="Times New Roman"/>
+        </w:rPr>
+      </w:pPr>
+      <w:r>
+        <w:rPr>
+          <w:rFonts w:cs="Times New Roman"/>
+        </w:rPr>
+        <w:t>Register and manage customers, hotel owners, and administrators.</w:t>
+      </w:r>
+    </w:p>
+    <w:p>
+      <w:pPr>
+        <w:numPr>
+          <w:ilvl w:val="0"/>
+          <w:numId w:val="7"/>
+        </w:numPr>
+        <w:spacing w:line="278" w:lineRule="auto"/>
+        <w:rPr>
+          <w:rFonts w:cs="Times New Roman"/>
+        </w:rPr>
+      </w:pPr>
+      <w:r>
+        <w:rPr>
+          <w:rFonts w:cs="Times New Roman"/>
+        </w:rPr>
+        <w:t>Allow hotel owners to create and manage hotel and hall information.</w:t>
+      </w:r>
+    </w:p>
+    <w:p>
+      <w:pPr>
+        <w:numPr>
+          <w:ilvl w:val="0"/>
+          <w:numId w:val="7"/>
+        </w:numPr>
+        <w:spacing w:line="278" w:lineRule="auto"/>
+        <w:rPr>
+          <w:rFonts w:cs="Times New Roman"/>
+        </w:rPr>
+      </w:pPr>
+      <w:r>
+        <w:rPr>
+          <w:rFonts w:cs="Times New Roman"/>
+        </w:rPr>
+        <w:t>Process customer booking requests.</w:t>
+      </w:r>
+    </w:p>
+    <w:p>
+      <w:pPr>
+        <w:numPr>
+          <w:ilvl w:val="0"/>
+          <w:numId w:val="7"/>
+        </w:numPr>
+        <w:spacing w:line="278" w:lineRule="auto"/>
+        <w:rPr>
+          <w:rFonts w:cs="Times New Roman"/>
+        </w:rPr>
+      </w:pPr>
+      <w:r>
+        <w:rPr>
+          <w:rFonts w:cs="Times New Roman"/>
+        </w:rPr>
+        <w:t>Check hall availability before creating a booking to prevent double reservations.</w:t>
+      </w:r>
+    </w:p>
+    <w:p>
+      <w:pPr>
+        <w:numPr>
+          <w:ilvl w:val="0"/>
+          <w:numId w:val="7"/>
+        </w:numPr>
+        <w:spacing w:line="278" w:lineRule="auto"/>
+        <w:rPr>
+          <w:rFonts w:cs="Times New Roman"/>
+        </w:rPr>
+      </w:pPr>
+      <w:r>
+        <w:rPr>
+          <w:rFonts w:cs="Times New Roman"/>
+        </w:rPr>
+        <w:t>Allow administrators to approve or reject hotel registrations.</w:t>
+      </w:r>
+    </w:p>
+    <w:p>
+      <w:pPr>
+        <w:numPr>
+          <w:ilvl w:val="0"/>
+          <w:numId w:val="7"/>
+        </w:numPr>
+        <w:spacing w:line="278" w:lineRule="auto"/>
+        <w:rPr>
+          <w:rFonts w:cs="Times New Roman"/>
+        </w:rPr>
+      </w:pPr>
+      <w:r>
+        <w:rPr>
+          <w:rFonts w:cs="Times New Roman"/>
+        </w:rPr>
+        <w:t>Store and retrieve application data from MongoDB.</w:t>
+      </w:r>
+    </w:p>
+    <w:p>
+      <w:pPr>
+        <w:numPr>
+          <w:ilvl w:val="0"/>
+          <w:numId w:val="7"/>
+        </w:numPr>
+        <w:spacing w:line="278" w:lineRule="auto"/>
+        <w:rPr>
+          <w:rFonts w:cs="Times New Roman"/>
+        </w:rPr>
+      </w:pPr>
+      <w:r>
+        <w:rPr>
+          <w:rFonts w:cs="Times New Roman"/>
+        </w:rPr>
+        <w:t>Generate booking invoices in PDF format after a reservation is confirmed.</w:t>
+      </w:r>
+    </w:p>
+    <w:p>
+      <w:pPr>
+        <w:rPr>
+          <w:rFonts w:cs="Times New Roman"/>
+        </w:rPr>
+      </w:pPr>
     </w:p>
     <w:p/>
     <w:sectPr>
@@ -170,6 +342,155 @@
     </w:lvl>
   </w:abstractNum>
   <w:abstractNum w:abstractNumId="1" w15:restartNumberingAfterBreak="0">
+    <w:nsid w:val="3CCB038A"/>
+    <w:multiLevelType w:val="multilevel"/>
+    <w:tmpl w:val="FDAC7682"/>
+    <w:lvl w:ilvl="0">
+      <w:start w:val="1"/>
+      <w:numFmt w:val="bullet"/>
+      <w:lvlText w:val=""/>
+      <w:lvlJc w:val="left"/>
+      <w:pPr>
+        <w:tabs>
+          <w:tab w:val="num" w:pos="720"/>
+        </w:tabs>
+        <w:ind w:left="720" w:hanging="360"/>
+      </w:pPr>
+      <w:rPr>
+        <w:rFonts w:ascii="Symbol" w:hAnsi="Symbol" w:hint="default"/>
+        <w:sz w:val="20"/>
+      </w:rPr>
+    </w:lvl>
+    <w:lvl w:ilvl="1" w:tentative="1">
+      <w:start w:val="1"/>
+      <w:numFmt w:val="bullet"/>
+      <w:lvlText w:val="o"/>
+      <w:lvlJc w:val="left"/>
+      <w:pPr>
+        <w:tabs>
+          <w:tab w:val="num" w:pos="1440"/>
+        </w:tabs>
+        <w:ind w:left="1440" w:hanging="360"/>
+      </w:pPr>
+      <w:rPr>
+        <w:rFonts w:ascii="Courier New" w:hAnsi="Courier New" w:hint="default"/>
+        <w:sz w:val="20"/>
+      </w:rPr>
+    </w:lvl>
+    <w:lvl w:ilvl="2" w:tentative="1">
+      <w:start w:val="1"/>
+      <w:numFmt w:val="bullet"/>
+      <w:lvlText w:val=""/>
+      <w:lvlJc w:val="left"/>
+      <w:pPr>
+        <w:tabs>
+          <w:tab w:val="num" w:pos="2160"/>
+        </w:tabs>
+        <w:ind w:left="2160" w:hanging="360"/>
+      </w:pPr>
+      <w:rPr>
+        <w:rFonts w:ascii="Wingdings" w:hAnsi="Wingdings" w:hint="default"/>
+        <w:sz w:val="20"/>
+      </w:rPr>
+    </w:lvl>
+    <w:lvl w:ilvl="3" w:tentative="1">
+      <w:start w:val="1"/>
+      <w:numFmt w:val="bullet"/>
+      <w:lvlText w:val=""/>
+      <w:lvlJc w:val="left"/>
+      <w:pPr>
+        <w:tabs>
+          <w:tab w:val="num" w:pos="2880"/>
+        </w:tabs>
+        <w:ind w:left="2880" w:hanging="360"/>
+      </w:pPr>
+      <w:rPr>
+        <w:rFonts w:ascii="Wingdings" w:hAnsi="Wingdings" w:hint="default"/>
+        <w:sz w:val="20"/>
+      </w:rPr>
+    </w:lvl>
+    <w:lvl w:ilvl="4" w:tentative="1">
+      <w:start w:val="1"/>
+      <w:numFmt w:val="bullet"/>
+      <w:lvlText w:val=""/>
+      <w:lvlJc w:val="left"/>
+      <w:pPr>
+        <w:tabs>
+          <w:tab w:val="num" w:pos="3600"/>
+        </w:tabs>
+        <w:ind w:left="3600" w:hanging="360"/>
+      </w:pPr>
+      <w:rPr>
+        <w:rFonts w:ascii="Wingdings" w:hAnsi="Wingdings" w:hint="default"/>
+        <w:sz w:val="20"/>
+      </w:rPr>
+    </w:lvl>
+    <w:lvl w:ilvl="5" w:tentative="1">
+      <w:start w:val="1"/>
+      <w:numFmt w:val="bullet"/>
+      <w:lvlText w:val=""/>
+      <w:lvlJc w:val="left"/>
+      <w:pPr>
+        <w:tabs>
+          <w:tab w:val="num" w:pos="4320"/>
+        </w:tabs>
+        <w:ind w:left="4320" w:hanging="360"/>
+      </w:pPr>
+      <w:rPr>
+        <w:rFonts w:ascii="Wingdings" w:hAnsi="Wingdings" w:hint="default"/>
+        <w:sz w:val="20"/>
+      </w:rPr>
+    </w:lvl>
+    <w:lvl w:ilvl="6" w:tentative="1">
+      <w:start w:val="1"/>
+      <w:numFmt w:val="bullet"/>
+      <w:lvlText w:val=""/>
+      <w:lvlJc w:val="left"/>
+      <w:pPr>
+        <w:tabs>
+          <w:tab w:val="num" w:pos="5040"/>
+        </w:tabs>
+        <w:ind w:left="5040" w:hanging="360"/>
+      </w:pPr>
+      <w:rPr>
+        <w:rFonts w:ascii="Wingdings" w:hAnsi="Wingdings" w:hint="default"/>
+        <w:sz w:val="20"/>
+      </w:rPr>
+    </w:lvl>
+    <w:lvl w:ilvl="7" w:tentative="1">
+      <w:start w:val="1"/>
+      <w:numFmt w:val="bullet"/>
+      <w:lvlText w:val=""/>
+      <w:lvlJc w:val="left"/>
+      <w:pPr>
+        <w:tabs>
+          <w:tab w:val="num" w:pos="5760"/>
+        </w:tabs>
+        <w:ind w:left="5760" w:hanging="360"/>
+      </w:pPr>
+      <w:rPr>
+        <w:rFonts w:ascii="Wingdings" w:hAnsi="Wingdings" w:hint="default"/>
+        <w:sz w:val="20"/>
+      </w:rPr>
+    </w:lvl>
+    <w:lvl w:ilvl="8" w:tentative="1">
+      <w:start w:val="1"/>
+      <w:numFmt w:val="bullet"/>
+      <w:lvlText w:val=""/>
+      <w:lvlJc w:val="left"/>
+      <w:pPr>
+        <w:tabs>
+          <w:tab w:val="num" w:pos="6480"/>
+        </w:tabs>
+        <w:ind w:left="6480" w:hanging="360"/>
+      </w:pPr>
+      <w:rPr>
+        <w:rFonts w:ascii="Wingdings" w:hAnsi="Wingdings" w:hint="default"/>
+        <w:sz w:val="20"/>
+      </w:rPr>
+    </w:lvl>
+  </w:abstractNum>
+  <w:abstractNum w:abstractNumId="2" w15:restartNumberingAfterBreak="0">
     <w:nsid w:val="58B67ABF"/>
     <w:multiLevelType w:val="hybridMultilevel"/>
     <w:tmpl w:val="5A946B10"/>
@@ -282,7 +603,7 @@
       </w:rPr>
     </w:lvl>
   </w:abstractNum>
-  <w:abstractNum w:abstractNumId="2" w15:restartNumberingAfterBreak="0">
+  <w:abstractNum w:abstractNumId="3" w15:restartNumberingAfterBreak="0">
     <w:nsid w:val="66580E18"/>
     <w:multiLevelType w:val="hybridMultilevel"/>
     <w:tmpl w:val="2A2C2956"/>
@@ -396,22 +717,25 @@
     </w:lvl>
   </w:abstractNum>
   <w:num w:numId="1" w16cid:durableId="158273319">
-    <w:abstractNumId w:val="1"/>
+    <w:abstractNumId w:val="2"/>
   </w:num>
   <w:num w:numId="2" w16cid:durableId="280040286">
-    <w:abstractNumId w:val="1"/>
+    <w:abstractNumId w:val="2"/>
   </w:num>
   <w:num w:numId="3" w16cid:durableId="215823023">
-    <w:abstractNumId w:val="1"/>
+    <w:abstractNumId w:val="2"/>
   </w:num>
   <w:num w:numId="4" w16cid:durableId="1516337694">
-    <w:abstractNumId w:val="2"/>
+    <w:abstractNumId w:val="3"/>
   </w:num>
   <w:num w:numId="5" w16cid:durableId="1649742240">
     <w:abstractNumId w:val="0"/>
   </w:num>
   <w:num w:numId="6" w16cid:durableId="701825935">
     <w:abstractNumId w:val="0"/>
+  </w:num>
+  <w:num w:numId="7" w16cid:durableId="1985741485">
+    <w:abstractNumId w:val="1"/>
   </w:num>
 </w:numbering>
 </file>

</xml_diff>

<commit_message>
waxaan soo commit gareeyey DOCUMENTATION FILE 4
</commit_message>
<xml_diff>
--- a/Documention.md.docx
+++ b/Documention.md.docx
@@ -235,6 +235,368 @@
         <w:t>Generate booking invoices in PDF format after a reservation is confirmed.</w:t>
       </w:r>
     </w:p>
+    <w:p>
+      <w:pPr>
+        <w:pStyle w:val="Heading2"/>
+      </w:pPr>
+      <w:r>
+        <w:t>Backend Organization</w:t>
+      </w:r>
+    </w:p>
+    <w:p>
+      <w:pPr>
+        <w:rPr>
+          <w:rFonts w:cs="Times New Roman"/>
+        </w:rPr>
+      </w:pPr>
+      <w:r>
+        <w:rPr>
+          <w:rFonts w:cs="Times New Roman"/>
+        </w:rPr>
+        <w:t>The backend is divided into several folders to keep the project organized and maintainable.</w:t>
+      </w:r>
+    </w:p>
+    <w:tbl>
+      <w:tblPr>
+        <w:tblW w:w="0" w:type="auto"/>
+        <w:tblCellSpacing w:w="15" w:type="dxa"/>
+        <w:tblCellMar>
+          <w:top w:w="15" w:type="dxa"/>
+          <w:left w:w="15" w:type="dxa"/>
+          <w:bottom w:w="15" w:type="dxa"/>
+          <w:right w:w="15" w:type="dxa"/>
+        </w:tblCellMar>
+        <w:tblLook w:val="04A0" w:firstRow="1" w:lastRow="0" w:firstColumn="1" w:lastColumn="0" w:noHBand="0" w:noVBand="1"/>
+      </w:tblPr>
+      <w:tblGrid>
+        <w:gridCol w:w="1275"/>
+        <w:gridCol w:w="7751"/>
+      </w:tblGrid>
+      <w:tr>
+        <w:trPr>
+          <w:tblHeader/>
+          <w:tblCellSpacing w:w="15" w:type="dxa"/>
+        </w:trPr>
+        <w:tc>
+          <w:tcPr>
+            <w:tcW w:w="0" w:type="auto"/>
+            <w:vAlign w:val="center"/>
+            <w:hideMark/>
+          </w:tcPr>
+          <w:p>
+            <w:pPr>
+              <w:rPr>
+                <w:rFonts w:cs="Times New Roman"/>
+                <w:b/>
+                <w:bCs/>
+              </w:rPr>
+            </w:pPr>
+            <w:r>
+              <w:rPr>
+                <w:rFonts w:cs="Times New Roman"/>
+                <w:b/>
+                <w:bCs/>
+              </w:rPr>
+              <w:t>Folder</w:t>
+            </w:r>
+          </w:p>
+        </w:tc>
+        <w:tc>
+          <w:tcPr>
+            <w:tcW w:w="0" w:type="auto"/>
+            <w:vAlign w:val="center"/>
+            <w:hideMark/>
+          </w:tcPr>
+          <w:p>
+            <w:pPr>
+              <w:rPr>
+                <w:rFonts w:cs="Times New Roman"/>
+                <w:b/>
+                <w:bCs/>
+              </w:rPr>
+            </w:pPr>
+            <w:r>
+              <w:rPr>
+                <w:rFonts w:cs="Times New Roman"/>
+                <w:b/>
+                <w:bCs/>
+              </w:rPr>
+              <w:t>Description</w:t>
+            </w:r>
+          </w:p>
+        </w:tc>
+      </w:tr>
+      <w:tr>
+        <w:trPr>
+          <w:tblCellSpacing w:w="15" w:type="dxa"/>
+        </w:trPr>
+        <w:tc>
+          <w:tcPr>
+            <w:tcW w:w="0" w:type="auto"/>
+            <w:vAlign w:val="center"/>
+            <w:hideMark/>
+          </w:tcPr>
+          <w:p>
+            <w:pPr>
+              <w:rPr>
+                <w:rFonts w:cs="Times New Roman"/>
+              </w:rPr>
+            </w:pPr>
+            <w:r>
+              <w:rPr>
+                <w:rFonts w:cs="Times New Roman"/>
+              </w:rPr>
+              <w:t>config/</w:t>
+            </w:r>
+          </w:p>
+        </w:tc>
+        <w:tc>
+          <w:tcPr>
+            <w:tcW w:w="0" w:type="auto"/>
+            <w:vAlign w:val="center"/>
+            <w:hideMark/>
+          </w:tcPr>
+          <w:p>
+            <w:pPr>
+              <w:rPr>
+                <w:rFonts w:cs="Times New Roman"/>
+              </w:rPr>
+            </w:pPr>
+            <w:r>
+              <w:rPr>
+                <w:rFonts w:cs="Times New Roman"/>
+              </w:rPr>
+              <w:t>Database connection and application configuration files.</w:t>
+            </w:r>
+          </w:p>
+        </w:tc>
+      </w:tr>
+      <w:tr>
+        <w:trPr>
+          <w:tblCellSpacing w:w="15" w:type="dxa"/>
+        </w:trPr>
+        <w:tc>
+          <w:tcPr>
+            <w:tcW w:w="0" w:type="auto"/>
+            <w:vAlign w:val="center"/>
+            <w:hideMark/>
+          </w:tcPr>
+          <w:p>
+            <w:pPr>
+              <w:rPr>
+                <w:rFonts w:cs="Times New Roman"/>
+              </w:rPr>
+            </w:pPr>
+            <w:r>
+              <w:rPr>
+                <w:rFonts w:cs="Times New Roman"/>
+              </w:rPr>
+              <w:t>controllers/</w:t>
+            </w:r>
+          </w:p>
+        </w:tc>
+        <w:tc>
+          <w:tcPr>
+            <w:tcW w:w="0" w:type="auto"/>
+            <w:vAlign w:val="center"/>
+            <w:hideMark/>
+          </w:tcPr>
+          <w:p>
+            <w:pPr>
+              <w:rPr>
+                <w:rFonts w:cs="Times New Roman"/>
+              </w:rPr>
+            </w:pPr>
+            <w:r>
+              <w:rPr>
+                <w:rFonts w:cs="Times New Roman"/>
+              </w:rPr>
+              <w:t>Contains the functions that process client requests and return responses.</w:t>
+            </w:r>
+          </w:p>
+        </w:tc>
+      </w:tr>
+      <w:tr>
+        <w:trPr>
+          <w:tblCellSpacing w:w="15" w:type="dxa"/>
+        </w:trPr>
+        <w:tc>
+          <w:tcPr>
+            <w:tcW w:w="0" w:type="auto"/>
+            <w:vAlign w:val="center"/>
+            <w:hideMark/>
+          </w:tcPr>
+          <w:p>
+            <w:pPr>
+              <w:rPr>
+                <w:rFonts w:cs="Times New Roman"/>
+              </w:rPr>
+            </w:pPr>
+            <w:r>
+              <w:rPr>
+                <w:rFonts w:cs="Times New Roman"/>
+              </w:rPr>
+              <w:t>middleware/</w:t>
+            </w:r>
+          </w:p>
+        </w:tc>
+        <w:tc>
+          <w:tcPr>
+            <w:tcW w:w="0" w:type="auto"/>
+            <w:vAlign w:val="center"/>
+            <w:hideMark/>
+          </w:tcPr>
+          <w:p>
+            <w:pPr>
+              <w:rPr>
+                <w:rFonts w:cs="Times New Roman"/>
+              </w:rPr>
+            </w:pPr>
+            <w:r>
+              <w:rPr>
+                <w:rFonts w:cs="Times New Roman"/>
+              </w:rPr>
+              <w:t>Includes authentication, authorization, validation, and error-handling middleware.</w:t>
+            </w:r>
+          </w:p>
+        </w:tc>
+      </w:tr>
+      <w:tr>
+        <w:trPr>
+          <w:tblCellSpacing w:w="15" w:type="dxa"/>
+        </w:trPr>
+        <w:tc>
+          <w:tcPr>
+            <w:tcW w:w="0" w:type="auto"/>
+            <w:vAlign w:val="center"/>
+            <w:hideMark/>
+          </w:tcPr>
+          <w:p>
+            <w:pPr>
+              <w:rPr>
+                <w:rFonts w:cs="Times New Roman"/>
+              </w:rPr>
+            </w:pPr>
+            <w:r>
+              <w:rPr>
+                <w:rFonts w:cs="Times New Roman"/>
+              </w:rPr>
+              <w:t>models/</w:t>
+            </w:r>
+          </w:p>
+        </w:tc>
+        <w:tc>
+          <w:tcPr>
+            <w:tcW w:w="0" w:type="auto"/>
+            <w:vAlign w:val="center"/>
+            <w:hideMark/>
+          </w:tcPr>
+          <w:p>
+            <w:pPr>
+              <w:rPr>
+                <w:rFonts w:cs="Times New Roman"/>
+              </w:rPr>
+            </w:pPr>
+            <w:r>
+              <w:rPr>
+                <w:rFonts w:cs="Times New Roman"/>
+              </w:rPr>
+              <w:t>Defines MongoDB schemas for users, hotels, halls, and bookings.</w:t>
+            </w:r>
+          </w:p>
+        </w:tc>
+      </w:tr>
+      <w:tr>
+        <w:trPr>
+          <w:tblCellSpacing w:w="15" w:type="dxa"/>
+        </w:trPr>
+        <w:tc>
+          <w:tcPr>
+            <w:tcW w:w="0" w:type="auto"/>
+            <w:vAlign w:val="center"/>
+            <w:hideMark/>
+          </w:tcPr>
+          <w:p>
+            <w:pPr>
+              <w:rPr>
+                <w:rFonts w:cs="Times New Roman"/>
+              </w:rPr>
+            </w:pPr>
+            <w:r>
+              <w:rPr>
+                <w:rFonts w:cs="Times New Roman"/>
+              </w:rPr>
+              <w:t>routes/</w:t>
+            </w:r>
+          </w:p>
+        </w:tc>
+        <w:tc>
+          <w:tcPr>
+            <w:tcW w:w="0" w:type="auto"/>
+            <w:vAlign w:val="center"/>
+            <w:hideMark/>
+          </w:tcPr>
+          <w:p>
+            <w:pPr>
+              <w:rPr>
+                <w:rFonts w:cs="Times New Roman"/>
+              </w:rPr>
+            </w:pPr>
+            <w:r>
+              <w:rPr>
+                <w:rFonts w:cs="Times New Roman"/>
+              </w:rPr>
+              <w:t>Contains all API routes used by the frontend.</w:t>
+            </w:r>
+          </w:p>
+        </w:tc>
+      </w:tr>
+      <w:tr>
+        <w:trPr>
+          <w:tblCellSpacing w:w="15" w:type="dxa"/>
+        </w:trPr>
+        <w:tc>
+          <w:tcPr>
+            <w:tcW w:w="0" w:type="auto"/>
+            <w:vAlign w:val="center"/>
+            <w:hideMark/>
+          </w:tcPr>
+          <w:p>
+            <w:pPr>
+              <w:rPr>
+                <w:rFonts w:cs="Times New Roman"/>
+              </w:rPr>
+            </w:pPr>
+            <w:r>
+              <w:rPr>
+                <w:rFonts w:cs="Times New Roman"/>
+              </w:rPr>
+              <w:t>services/</w:t>
+            </w:r>
+          </w:p>
+        </w:tc>
+        <w:tc>
+          <w:tcPr>
+            <w:tcW w:w="0" w:type="auto"/>
+            <w:vAlign w:val="center"/>
+            <w:hideMark/>
+          </w:tcPr>
+          <w:p>
+            <w:pPr>
+              <w:rPr>
+                <w:rFonts w:cs="Times New Roman"/>
+              </w:rPr>
+            </w:pPr>
+            <w:r>
+              <w:rPr>
+                <w:rFonts w:cs="Times New Roman"/>
+              </w:rPr>
+              <w:t>Implements business logic such as booking validation and PDF generation.</w:t>
+            </w:r>
+          </w:p>
+        </w:tc>
+      </w:tr>
+    </w:tbl>
     <w:p>
       <w:pPr>
         <w:rPr>

</xml_diff>

<commit_message>
waxaan soo commit gareeyey Document FILE-ka Request Processing
</commit_message>
<xml_diff>
--- a/Documention.md.docx
+++ b/Documention.md.docx
@@ -601,8 +601,96 @@
       <w:pPr>
         <w:rPr>
           <w:rFonts w:cs="Times New Roman"/>
-        </w:rPr>
-      </w:pPr>
+          <w:b/>
+          <w:bCs/>
+        </w:rPr>
+      </w:pPr>
+      <w:r>
+        <w:rPr>
+          <w:rFonts w:cs="Times New Roman"/>
+          <w:b/>
+          <w:bCs/>
+        </w:rPr>
+        <w:lastRenderedPageBreak/>
+        <w:t>Request Processing</w:t>
+      </w:r>
+    </w:p>
+    <w:p>
+      <w:pPr>
+        <w:rPr>
+          <w:rFonts w:cs="Times New Roman"/>
+        </w:rPr>
+      </w:pPr>
+      <w:r>
+        <w:rPr>
+          <w:rFonts w:cs="Times New Roman"/>
+        </w:rPr>
+        <w:t>When a user performs an action, such as booking a hall or logging in, the request follows these steps:</w:t>
+      </w:r>
+    </w:p>
+    <w:p>
+      <w:pPr>
+        <w:rPr>
+          <w:rFonts w:cs="Times New Roman"/>
+        </w:rPr>
+      </w:pPr>
+      <w:r>
+        <w:rPr>
+          <w:rFonts w:cs="Times New Roman"/>
+        </w:rPr>
+        <w:t>Frontend</w:t>
+      </w:r>
+    </w:p>
+    <w:p>
+      <w:pPr>
+        <w:rPr>
+          <w:rFonts w:cs="Times New Roman"/>
+        </w:rPr>
+      </w:pPr>
+      <w:r>
+        <w:rPr>
+          <w:rFonts w:cs="Times New Roman"/>
+        </w:rPr>
+        <w:t xml:space="preserve">   │</w:t>
+      </w:r>
+    </w:p>
+    <w:p>
+      <w:pPr>
+        <w:rPr>
+          <w:rFonts w:cs="Times New Roman"/>
+        </w:rPr>
+      </w:pPr>
+      <w:r>
+        <w:rPr>
+          <w:rFonts w:cs="Times New Roman"/>
+        </w:rPr>
+        <w:t xml:space="preserve">  </w:t>
+      </w:r>
+      <w:r>
+        <w:rPr>
+          <w:rFonts w:cs="Times New Roman"/>
+        </w:rPr>
+        <w:t xml:space="preserve"> </w:t>
+      </w:r>
+      <w:r>
+        <w:rPr>
+          <w:rFonts w:cs="Times New Roman"/>
+        </w:rPr>
+        <w:t>▼</w:t>
+      </w:r>
+    </w:p>
+    <w:p>
+      <w:pPr>
+        <w:rPr>
+          <w:rFonts w:cs="Times New Roman"/>
+        </w:rPr>
+      </w:pPr>
+      <w:r>
+        <w:rPr>
+          <w:rFonts w:cs="Times New Roman"/>
+        </w:rPr>
+        <w:t>Express Route</w:t>
+      </w:r>
     </w:p>
     <w:p/>
     <w:sectPr>

</xml_diff>

<commit_message>
waxaan soo commit gareeyey DOCUMENT FILE-ka Authentication & Validation
</commit_message>
<xml_diff>
--- a/Documention.md.docx
+++ b/Documention.md.docx
@@ -690,6 +690,83 @@
           <w:rFonts w:cs="Times New Roman"/>
         </w:rPr>
         <w:t>Express Route</w:t>
+      </w:r>
+    </w:p>
+    <w:p>
+      <w:pPr>
+        <w:rPr>
+          <w:rFonts w:cs="Times New Roman"/>
+        </w:rPr>
+      </w:pPr>
+      <w:r>
+        <w:rPr>
+          <w:rFonts w:cs="Times New Roman"/>
+        </w:rPr>
+        <w:t>│</w:t>
+      </w:r>
+    </w:p>
+    <w:p>
+      <w:pPr>
+        <w:rPr>
+          <w:rFonts w:cs="Times New Roman"/>
+        </w:rPr>
+      </w:pPr>
+      <w:r>
+        <w:rPr>
+          <w:rFonts w:cs="Times New Roman"/>
+        </w:rPr>
+        <w:t>▼</w:t>
+      </w:r>
+    </w:p>
+    <w:p>
+      <w:pPr>
+        <w:rPr>
+          <w:rFonts w:cs="Times New Roman"/>
+        </w:rPr>
+      </w:pPr>
+      <w:r>
+        <w:rPr>
+          <w:rFonts w:cs="Times New Roman"/>
+        </w:rPr>
+        <w:t>Authentication &amp; Validation</w:t>
+      </w:r>
+    </w:p>
+    <w:p>
+      <w:pPr>
+        <w:rPr>
+          <w:rFonts w:cs="Times New Roman"/>
+        </w:rPr>
+      </w:pPr>
+      <w:r>
+        <w:rPr>
+          <w:rFonts w:cs="Times New Roman"/>
+        </w:rPr>
+        <w:t xml:space="preserve">   │</w:t>
+      </w:r>
+    </w:p>
+    <w:p>
+      <w:pPr>
+        <w:rPr>
+          <w:rFonts w:cs="Times New Roman"/>
+        </w:rPr>
+      </w:pPr>
+      <w:r>
+        <w:rPr>
+          <w:rFonts w:cs="Times New Roman"/>
+        </w:rPr>
+        <w:t xml:space="preserve">  </w:t>
+      </w:r>
+      <w:r>
+        <w:rPr>
+          <w:rFonts w:cs="Times New Roman"/>
+        </w:rPr>
+        <w:t xml:space="preserve"> </w:t>
+      </w:r>
+      <w:r>
+        <w:rPr>
+          <w:rFonts w:cs="Times New Roman"/>
+        </w:rPr>
+        <w:t>▼</w:t>
       </w:r>
     </w:p>
     <w:p/>

</xml_diff>

<commit_message>
waxaan soo commit gareeyey DOCUMENT FILE-ka controller and business logic
</commit_message>
<xml_diff>
--- a/Documention.md.docx
+++ b/Documention.md.docx
@@ -767,6 +767,84 @@
           <w:rFonts w:cs="Times New Roman"/>
         </w:rPr>
         <w:t>▼</w:t>
+      </w:r>
+    </w:p>
+    <w:p>
+      <w:pPr>
+        <w:rPr>
+          <w:rFonts w:cs="Times New Roman"/>
+        </w:rPr>
+      </w:pPr>
+      <w:r>
+        <w:rPr>
+          <w:rFonts w:cs="Times New Roman"/>
+        </w:rPr>
+        <w:t>Controller</w:t>
+      </w:r>
+    </w:p>
+    <w:p>
+      <w:pPr>
+        <w:rPr>
+          <w:rFonts w:cs="Times New Roman"/>
+        </w:rPr>
+      </w:pPr>
+      <w:r>
+        <w:rPr>
+          <w:rFonts w:cs="Times New Roman"/>
+        </w:rPr>
+        <w:t xml:space="preserve">   │</w:t>
+      </w:r>
+    </w:p>
+    <w:p>
+      <w:pPr>
+        <w:rPr>
+          <w:rFonts w:cs="Times New Roman"/>
+        </w:rPr>
+      </w:pPr>
+      <w:r>
+        <w:rPr>
+          <w:rFonts w:cs="Times New Roman"/>
+        </w:rPr>
+        <w:t xml:space="preserve">   ▼</w:t>
+      </w:r>
+    </w:p>
+    <w:p>
+      <w:pPr>
+        <w:rPr>
+          <w:rFonts w:cs="Times New Roman"/>
+        </w:rPr>
+      </w:pPr>
+      <w:r>
+        <w:rPr>
+          <w:rFonts w:cs="Times New Roman"/>
+        </w:rPr>
+        <w:t>Business Logic</w:t>
+      </w:r>
+    </w:p>
+    <w:p>
+      <w:pPr>
+        <w:rPr>
+          <w:rFonts w:cs="Times New Roman"/>
+        </w:rPr>
+      </w:pPr>
+      <w:r>
+        <w:rPr>
+          <w:rFonts w:cs="Times New Roman"/>
+        </w:rPr>
+        <w:t xml:space="preserve">   │</w:t>
+      </w:r>
+    </w:p>
+    <w:p>
+      <w:pPr>
+        <w:rPr>
+          <w:rFonts w:cs="Times New Roman"/>
+        </w:rPr>
+      </w:pPr>
+      <w:r>
+        <w:rPr>
+          <w:rFonts w:cs="Times New Roman"/>
+        </w:rPr>
+        <w:t xml:space="preserve">   ▼</w:t>
       </w:r>
     </w:p>
     <w:p/>

</xml_diff>

<commit_message>
waxaan soo commit gareeyey DOCUMENT FILE-ka MongoDB
</commit_message>
<xml_diff>
--- a/Documention.md.docx
+++ b/Documention.md.docx
@@ -846,6 +846,65 @@
         </w:rPr>
         <w:t xml:space="preserve">   ▼</w:t>
       </w:r>
+    </w:p>
+    <w:p>
+      <w:pPr>
+        <w:rPr>
+          <w:rFonts w:cs="Times New Roman"/>
+        </w:rPr>
+      </w:pPr>
+      <w:r>
+        <w:rPr>
+          <w:rFonts w:cs="Times New Roman"/>
+        </w:rPr>
+        <w:t>MongoDB</w:t>
+      </w:r>
+    </w:p>
+    <w:p>
+      <w:pPr>
+        <w:rPr>
+          <w:rFonts w:cs="Times New Roman"/>
+        </w:rPr>
+      </w:pPr>
+      <w:r>
+        <w:rPr>
+          <w:rFonts w:cs="Times New Roman"/>
+        </w:rPr>
+        <w:t xml:space="preserve">   │</w:t>
+      </w:r>
+    </w:p>
+    <w:p>
+      <w:pPr>
+        <w:rPr>
+          <w:rFonts w:cs="Times New Roman"/>
+        </w:rPr>
+      </w:pPr>
+      <w:r>
+        <w:rPr>
+          <w:rFonts w:cs="Times New Roman"/>
+        </w:rPr>
+        <w:t xml:space="preserve">   ▼</w:t>
+      </w:r>
+    </w:p>
+    <w:p>
+      <w:pPr>
+        <w:rPr>
+          <w:rFonts w:cs="Times New Roman"/>
+        </w:rPr>
+      </w:pPr>
+      <w:r>
+        <w:rPr>
+          <w:rFonts w:cs="Times New Roman"/>
+        </w:rPr>
+        <w:t>Response Returned to the Frontend</w:t>
+      </w:r>
+    </w:p>
+    <w:p>
+      <w:pPr>
+        <w:rPr>
+          <w:rFonts w:cs="Times New Roman"/>
+        </w:rPr>
+      </w:pPr>
     </w:p>
     <w:p/>
     <w:sectPr>

</xml_diff>

<commit_message>
waxaan soo commit gareeyey DOCUMENT FILE-ka Security
</commit_message>
<xml_diff>
--- a/Documention.md.docx
+++ b/Documention.md.docx
@@ -903,6 +903,104 @@
       <w:pPr>
         <w:rPr>
           <w:rFonts w:cs="Times New Roman"/>
+          <w:b/>
+          <w:bCs/>
+        </w:rPr>
+      </w:pPr>
+      <w:r>
+        <w:rPr>
+          <w:rFonts w:cs="Times New Roman"/>
+          <w:b/>
+          <w:bCs/>
+        </w:rPr>
+        <w:t>Security</w:t>
+      </w:r>
+    </w:p>
+    <w:p>
+      <w:pPr>
+        <w:rPr>
+          <w:rFonts w:cs="Times New Roman"/>
+        </w:rPr>
+      </w:pPr>
+      <w:r>
+        <w:rPr>
+          <w:rFonts w:cs="Times New Roman"/>
+        </w:rPr>
+        <w:t>To protect user information and application data, the backend includes several security mechanisms:</w:t>
+      </w:r>
+    </w:p>
+    <w:p>
+      <w:pPr>
+        <w:numPr>
+          <w:ilvl w:val="0"/>
+          <w:numId w:val="8"/>
+        </w:numPr>
+        <w:spacing w:line="278" w:lineRule="auto"/>
+        <w:jc w:val="left"/>
+        <w:rPr>
+          <w:rFonts w:cs="Times New Roman"/>
+        </w:rPr>
+      </w:pPr>
+      <w:r>
+        <w:rPr>
+          <w:rFonts w:cs="Times New Roman"/>
+        </w:rPr>
+        <w:t xml:space="preserve">Passwords are encrypted using </w:t>
+      </w:r>
+      <w:proofErr w:type="spellStart"/>
+      <w:r>
+        <w:rPr>
+          <w:rFonts w:cs="Times New Roman"/>
+          <w:b/>
+          <w:bCs/>
+        </w:rPr>
+        <w:t>bcrypt</w:t>
+      </w:r>
+      <w:proofErr w:type="spellEnd"/>
+      <w:r>
+        <w:rPr>
+          <w:rFonts w:cs="Times New Roman"/>
+        </w:rPr>
+        <w:t xml:space="preserve"> before being stored.</w:t>
+      </w:r>
+    </w:p>
+    <w:p>
+      <w:pPr>
+        <w:numPr>
+          <w:ilvl w:val="0"/>
+          <w:numId w:val="8"/>
+        </w:numPr>
+        <w:spacing w:line="278" w:lineRule="auto"/>
+        <w:jc w:val="left"/>
+        <w:rPr>
+          <w:rFonts w:cs="Times New Roman"/>
+        </w:rPr>
+      </w:pPr>
+      <w:r>
+        <w:rPr>
+          <w:rFonts w:cs="Times New Roman"/>
+        </w:rPr>
+        <w:t xml:space="preserve">Protected routes require a valid </w:t>
+      </w:r>
+      <w:r>
+        <w:rPr>
+          <w:rFonts w:cs="Times New Roman"/>
+          <w:b/>
+          <w:bCs/>
+        </w:rPr>
+        <w:t>JWT</w:t>
+      </w:r>
+      <w:r>
+        <w:rPr>
+          <w:rFonts w:cs="Times New Roman"/>
+        </w:rPr>
+        <w:t xml:space="preserve"> token.</w:t>
+      </w:r>
+    </w:p>
+    <w:p>
+      <w:pPr>
+        <w:rPr>
+          <w:rFonts w:cs="Times New Roman"/>
         </w:rPr>
       </w:pPr>
     </w:p>
@@ -920,6 +1018,155 @@
 <file path=word/numbering.xml><?xml version="1.0" encoding="utf-8"?>
 <w:numbering xmlns:wpc="http://schemas.microsoft.com/office/word/2010/wordprocessingCanvas" xmlns:cx="http://schemas.microsoft.com/office/drawing/2014/chartex" xmlns:cx1="http://schemas.microsoft.com/office/drawing/2015/9/8/chartex" xmlns:cx2="http://schemas.microsoft.com/office/drawing/2015/10/21/chartex" xmlns:cx3="http://schemas.microsoft.com/office/drawing/2016/5/9/chartex" xmlns:cx4="http://schemas.microsoft.com/office/drawing/2016/5/10/chartex" xmlns:cx5="http://schemas.microsoft.com/office/drawing/2016/5/11/chartex" xmlns:cx6="http://schemas.microsoft.com/office/drawing/2016/5/12/chartex" xmlns:cx7="http://schemas.microsoft.com/office/drawing/2016/5/13/chartex" xmlns:cx8="http://schemas.microsoft.com/office/drawing/2016/5/14/chartex" xmlns:mc="http://schemas.openxmlformats.org/markup-compatibility/2006" xmlns:aink="http://schemas.microsoft.com/office/drawing/2016/ink" xmlns:am3d="http://schemas.microsoft.com/office/drawing/2017/model3d" xmlns:o="urn:schemas-microsoft-com:office:office" xmlns:oel="http://schemas.microsoft.com/office/2019/extlst" xmlns:r="http://schemas.openxmlformats.org/officeDocument/2006/relationships" xmlns:m="http://schemas.openxmlformats.org/officeDocument/2006/math" xmlns:v="urn:schemas-microsoft-com:vml" xmlns:wp14="http://schemas.microsoft.com/office/word/2010/wordprocessingDrawing" xmlns:wp="http://schemas.openxmlformats.org/drawingml/2006/wordprocessingDrawing" xmlns:w10="urn:schemas-microsoft-com:office:word" xmlns:w="http://schemas.openxmlformats.org/wordprocessingml/2006/main" xmlns:w14="http://schemas.microsoft.com/office/word/2010/wordml" xmlns:w15="http://schemas.microsoft.com/office/word/2012/wordml" xmlns:w16cei="http://schemas.microsoft.com/office/word/2026/wordml/cei" xmlns:w16cex="http://schemas.microsoft.com/office/word/2018/wordml/cex" xmlns:w16cid="http://schemas.microsoft.com/office/word/2016/wordml/cid" xmlns:w16="http://schemas.microsoft.com/office/word/2018/wordml" xmlns:w16du="http://schemas.microsoft.com/office/word/2023/wordml/word16du" xmlns:w16sdtdh="http://schemas.microsoft.com/office/word/2020/wordml/sdtdatahash" xmlns:w16sdtfl="http://schemas.microsoft.com/office/word/2024/wordml/sdtformatlock" xmlns:w16se="http://schemas.microsoft.com/office/word/2015/wordml/symex" xmlns:wpg="http://schemas.microsoft.com/office/word/2010/wordprocessingGroup" xmlns:wpi="http://schemas.microsoft.com/office/word/2010/wordprocessingInk" xmlns:wne="http://schemas.microsoft.com/office/word/2006/wordml" xmlns:wps="http://schemas.microsoft.com/office/word/2010/wordprocessingShape" mc:Ignorable="w14 w15 w16se w16cid w16 w16cex w16sdtdh w16sdtfl w16du wp14">
   <w:abstractNum w:abstractNumId="0" w15:restartNumberingAfterBreak="0">
+    <w:nsid w:val="174B51D6"/>
+    <w:multiLevelType w:val="multilevel"/>
+    <w:tmpl w:val="873C83EA"/>
+    <w:lvl w:ilvl="0">
+      <w:start w:val="1"/>
+      <w:numFmt w:val="bullet"/>
+      <w:lvlText w:val=""/>
+      <w:lvlJc w:val="left"/>
+      <w:pPr>
+        <w:tabs>
+          <w:tab w:val="num" w:pos="720"/>
+        </w:tabs>
+        <w:ind w:left="720" w:hanging="360"/>
+      </w:pPr>
+      <w:rPr>
+        <w:rFonts w:ascii="Symbol" w:hAnsi="Symbol" w:hint="default"/>
+        <w:sz w:val="20"/>
+      </w:rPr>
+    </w:lvl>
+    <w:lvl w:ilvl="1" w:tentative="1">
+      <w:start w:val="1"/>
+      <w:numFmt w:val="bullet"/>
+      <w:lvlText w:val="o"/>
+      <w:lvlJc w:val="left"/>
+      <w:pPr>
+        <w:tabs>
+          <w:tab w:val="num" w:pos="1440"/>
+        </w:tabs>
+        <w:ind w:left="1440" w:hanging="360"/>
+      </w:pPr>
+      <w:rPr>
+        <w:rFonts w:ascii="Courier New" w:hAnsi="Courier New" w:hint="default"/>
+        <w:sz w:val="20"/>
+      </w:rPr>
+    </w:lvl>
+    <w:lvl w:ilvl="2" w:tentative="1">
+      <w:start w:val="1"/>
+      <w:numFmt w:val="bullet"/>
+      <w:lvlText w:val=""/>
+      <w:lvlJc w:val="left"/>
+      <w:pPr>
+        <w:tabs>
+          <w:tab w:val="num" w:pos="2160"/>
+        </w:tabs>
+        <w:ind w:left="2160" w:hanging="360"/>
+      </w:pPr>
+      <w:rPr>
+        <w:rFonts w:ascii="Wingdings" w:hAnsi="Wingdings" w:hint="default"/>
+        <w:sz w:val="20"/>
+      </w:rPr>
+    </w:lvl>
+    <w:lvl w:ilvl="3" w:tentative="1">
+      <w:start w:val="1"/>
+      <w:numFmt w:val="bullet"/>
+      <w:lvlText w:val=""/>
+      <w:lvlJc w:val="left"/>
+      <w:pPr>
+        <w:tabs>
+          <w:tab w:val="num" w:pos="2880"/>
+        </w:tabs>
+        <w:ind w:left="2880" w:hanging="360"/>
+      </w:pPr>
+      <w:rPr>
+        <w:rFonts w:ascii="Wingdings" w:hAnsi="Wingdings" w:hint="default"/>
+        <w:sz w:val="20"/>
+      </w:rPr>
+    </w:lvl>
+    <w:lvl w:ilvl="4" w:tentative="1">
+      <w:start w:val="1"/>
+      <w:numFmt w:val="bullet"/>
+      <w:lvlText w:val=""/>
+      <w:lvlJc w:val="left"/>
+      <w:pPr>
+        <w:tabs>
+          <w:tab w:val="num" w:pos="3600"/>
+        </w:tabs>
+        <w:ind w:left="3600" w:hanging="360"/>
+      </w:pPr>
+      <w:rPr>
+        <w:rFonts w:ascii="Wingdings" w:hAnsi="Wingdings" w:hint="default"/>
+        <w:sz w:val="20"/>
+      </w:rPr>
+    </w:lvl>
+    <w:lvl w:ilvl="5" w:tentative="1">
+      <w:start w:val="1"/>
+      <w:numFmt w:val="bullet"/>
+      <w:lvlText w:val=""/>
+      <w:lvlJc w:val="left"/>
+      <w:pPr>
+        <w:tabs>
+          <w:tab w:val="num" w:pos="4320"/>
+        </w:tabs>
+        <w:ind w:left="4320" w:hanging="360"/>
+      </w:pPr>
+      <w:rPr>
+        <w:rFonts w:ascii="Wingdings" w:hAnsi="Wingdings" w:hint="default"/>
+        <w:sz w:val="20"/>
+      </w:rPr>
+    </w:lvl>
+    <w:lvl w:ilvl="6" w:tentative="1">
+      <w:start w:val="1"/>
+      <w:numFmt w:val="bullet"/>
+      <w:lvlText w:val=""/>
+      <w:lvlJc w:val="left"/>
+      <w:pPr>
+        <w:tabs>
+          <w:tab w:val="num" w:pos="5040"/>
+        </w:tabs>
+        <w:ind w:left="5040" w:hanging="360"/>
+      </w:pPr>
+      <w:rPr>
+        <w:rFonts w:ascii="Wingdings" w:hAnsi="Wingdings" w:hint="default"/>
+        <w:sz w:val="20"/>
+      </w:rPr>
+    </w:lvl>
+    <w:lvl w:ilvl="7" w:tentative="1">
+      <w:start w:val="1"/>
+      <w:numFmt w:val="bullet"/>
+      <w:lvlText w:val=""/>
+      <w:lvlJc w:val="left"/>
+      <w:pPr>
+        <w:tabs>
+          <w:tab w:val="num" w:pos="5760"/>
+        </w:tabs>
+        <w:ind w:left="5760" w:hanging="360"/>
+      </w:pPr>
+      <w:rPr>
+        <w:rFonts w:ascii="Wingdings" w:hAnsi="Wingdings" w:hint="default"/>
+        <w:sz w:val="20"/>
+      </w:rPr>
+    </w:lvl>
+    <w:lvl w:ilvl="8" w:tentative="1">
+      <w:start w:val="1"/>
+      <w:numFmt w:val="bullet"/>
+      <w:lvlText w:val=""/>
+      <w:lvlJc w:val="left"/>
+      <w:pPr>
+        <w:tabs>
+          <w:tab w:val="num" w:pos="6480"/>
+        </w:tabs>
+        <w:ind w:left="6480" w:hanging="360"/>
+      </w:pPr>
+      <w:rPr>
+        <w:rFonts w:ascii="Wingdings" w:hAnsi="Wingdings" w:hint="default"/>
+        <w:sz w:val="20"/>
+      </w:rPr>
+    </w:lvl>
+  </w:abstractNum>
+  <w:abstractNum w:abstractNumId="1" w15:restartNumberingAfterBreak="0">
     <w:nsid w:val="3C89107D"/>
     <w:multiLevelType w:val="hybridMultilevel"/>
     <w:tmpl w:val="5DBC62B2"/>
@@ -1005,7 +1252,7 @@
       </w:pPr>
     </w:lvl>
   </w:abstractNum>
-  <w:abstractNum w:abstractNumId="1" w15:restartNumberingAfterBreak="0">
+  <w:abstractNum w:abstractNumId="2" w15:restartNumberingAfterBreak="0">
     <w:nsid w:val="3CCB038A"/>
     <w:multiLevelType w:val="multilevel"/>
     <w:tmpl w:val="FDAC7682"/>
@@ -1154,7 +1401,7 @@
       </w:rPr>
     </w:lvl>
   </w:abstractNum>
-  <w:abstractNum w:abstractNumId="2" w15:restartNumberingAfterBreak="0">
+  <w:abstractNum w:abstractNumId="3" w15:restartNumberingAfterBreak="0">
     <w:nsid w:val="58B67ABF"/>
     <w:multiLevelType w:val="hybridMultilevel"/>
     <w:tmpl w:val="5A946B10"/>
@@ -1267,7 +1514,7 @@
       </w:rPr>
     </w:lvl>
   </w:abstractNum>
-  <w:abstractNum w:abstractNumId="3" w15:restartNumberingAfterBreak="0">
+  <w:abstractNum w:abstractNumId="4" w15:restartNumberingAfterBreak="0">
     <w:nsid w:val="66580E18"/>
     <w:multiLevelType w:val="hybridMultilevel"/>
     <w:tmpl w:val="2A2C2956"/>
@@ -1381,25 +1628,28 @@
     </w:lvl>
   </w:abstractNum>
   <w:num w:numId="1" w16cid:durableId="158273319">
+    <w:abstractNumId w:val="3"/>
+  </w:num>
+  <w:num w:numId="2" w16cid:durableId="280040286">
+    <w:abstractNumId w:val="3"/>
+  </w:num>
+  <w:num w:numId="3" w16cid:durableId="215823023">
+    <w:abstractNumId w:val="3"/>
+  </w:num>
+  <w:num w:numId="4" w16cid:durableId="1516337694">
+    <w:abstractNumId w:val="4"/>
+  </w:num>
+  <w:num w:numId="5" w16cid:durableId="1649742240">
+    <w:abstractNumId w:val="1"/>
+  </w:num>
+  <w:num w:numId="6" w16cid:durableId="701825935">
+    <w:abstractNumId w:val="1"/>
+  </w:num>
+  <w:num w:numId="7" w16cid:durableId="1985741485">
     <w:abstractNumId w:val="2"/>
   </w:num>
-  <w:num w:numId="2" w16cid:durableId="280040286">
-    <w:abstractNumId w:val="2"/>
-  </w:num>
-  <w:num w:numId="3" w16cid:durableId="215823023">
-    <w:abstractNumId w:val="2"/>
-  </w:num>
-  <w:num w:numId="4" w16cid:durableId="1516337694">
-    <w:abstractNumId w:val="3"/>
-  </w:num>
-  <w:num w:numId="5" w16cid:durableId="1649742240">
+  <w:num w:numId="8" w16cid:durableId="651057072">
     <w:abstractNumId w:val="0"/>
-  </w:num>
-  <w:num w:numId="6" w16cid:durableId="701825935">
-    <w:abstractNumId w:val="0"/>
-  </w:num>
-  <w:num w:numId="7" w16cid:durableId="1985741485">
-    <w:abstractNumId w:val="1"/>
   </w:num>
 </w:numbering>
 </file>

</xml_diff>

<commit_message>
waxaan soo commit gareeyey DOCUMENT FILE-ka Development Approach
</commit_message>
<xml_diff>
--- a/Documention.md.docx
+++ b/Documention.md.docx
@@ -1060,6 +1060,29 @@
           <w:rFonts w:cs="Times New Roman"/>
         </w:rPr>
         <w:t>Sensitive information, such as database credentials and secret keys, is stored in environment variables.</w:t>
+      </w:r>
+    </w:p>
+    <w:p>
+      <w:pPr>
+        <w:pStyle w:val="Heading2"/>
+      </w:pPr>
+      <w:r>
+        <w:t>Development Approach</w:t>
+      </w:r>
+    </w:p>
+    <w:p>
+      <w:pPr>
+        <w:rPr>
+          <w:rFonts w:cs="Times New Roman"/>
+          <w:b/>
+          <w:bCs/>
+        </w:rPr>
+      </w:pPr>
+      <w:r>
+        <w:rPr>
+          <w:rFonts w:cs="Times New Roman"/>
+        </w:rPr>
+        <w:t>The backend is designed to be easy to maintain and expand as the project grows. Each component has a clear responsibility, making the code easier to understand and update. This structure also allows future features, such as online payments, email notifications, and SMS confirmations, to be integrated with minimal changes to the existing system.</w:t>
       </w:r>
     </w:p>
     <w:p/>

</xml_diff>